<commit_message>
Resume: Cyber Security Analyst @ People Prime Worldwide (unknown)
</commit_message>
<xml_diff>
--- a/resumes/Resume_Cyber_Security_Analyst_People_Prime_Worldwide__unknown_.docx
+++ b/resumes/Resume_Cyber_Security_Analyst_People_Prime_Worldwide__unknown_.docx
@@ -413,7 +413,7 @@
           <w:sz w:val="19"/>
           <w:szCs w:val="19"/>
         </w:rPr>
-        <w:t>Triaged 50+ weekly inventory reimbursement cases by severity and policy eligibility, escalated findings to senior reviewers for incident response and management.</w:t>
+        <w:t>Triaged 50+ weekly inventory reimbursement cases by severity and policy eligibility, following structured case triage and escalation workflows, and escalated findings to senior reviewers.</w:t>
       </w:r>
     </w:p>
     <w:p>
@@ -432,7 +432,7 @@
           <w:sz w:val="19"/>
           <w:szCs w:val="19"/>
         </w:rPr>
-        <w:t>Conducted root cause analysis on seller claims, identifying policy violations and anomalous patterns, and documented findings in audit-ready case documentation for compliance and risk assessment.</w:t>
+        <w:t>Analyzed seller claims, identified policy violations and anomalous patterns, and escalated findings to senior reviewers.</w:t>
       </w:r>
     </w:p>
     <w:p>
@@ -451,7 +451,7 @@
           <w:sz w:val="19"/>
           <w:szCs w:val="19"/>
         </w:rPr>
-        <w:t>Spotted recurring fraud patterns across 200+ weekly cases and flagged them early, reducing repeat-issue investigation time before escalation, and contributing to risk management and incident response.</w:t>
+        <w:t>Maintained audit-ready case documentation, recording investigation findings, decisions, evidence notes, and corrective actions.</w:t>
       </w:r>
     </w:p>
     <w:p>
@@ -470,7 +470,7 @@
           <w:sz w:val="19"/>
           <w:szCs w:val="19"/>
         </w:rPr>
-        <w:t>Maintained audit-ready case documentation, recording investigation findings, decisions, evidence, and corrective actions for compliance and risk assessment.</w:t>
+        <w:t>Spotted recurring fraud patterns across 200+ weekly cases and flagged them early, reducing repeat-issue investigation time before escalation.</w:t>
       </w:r>
     </w:p>
     <w:p>
@@ -564,7 +564,7 @@
           <w:sz w:val="19"/>
           <w:szCs w:val="19"/>
         </w:rPr>
-        <w:t>Deployed Splunk SIEM with SPL searches for brute-force detection, lateral movement, and privilege escalation (T1110, T1078, T1059); mapped TTPs and wrote incident report.</w:t>
+        <w:t>Deployed Splunk SIEM with SPL searches for brute-force detection, lateral movement, and privilege escalation; mapped TTPs to MITRE ATT&amp;CK (T1110, T1078, T1059) and wrote incident report.</w:t>
       </w:r>
     </w:p>
     <w:p>
@@ -583,7 +583,7 @@
           <w:sz w:val="19"/>
           <w:szCs w:val="19"/>
         </w:rPr>
-        <w:t>Developed SOAR-style detection pipeline: Python script ingests Splunk alerts, enriches with VirusTotal API, and dispatches Telegram notifications, reducing mean time to triage by 50% (EPSS 8.5).</w:t>
+        <w:t>Built automated SOAR-style detection pipeline: ingests Splunk alerts, enriches with VirusTotal API, dispatches Telegram notifications with severity classification.</w:t>
       </w:r>
     </w:p>
     <w:p>
@@ -672,7 +672,7 @@
           <w:sz w:val="19"/>
           <w:szCs w:val="19"/>
         </w:rPr>
-        <w:t>Developed automated vulnerability assessment pipeline in Python, integrating Nessus and OpenVAS APIs, generating CVE reports with CVSS severity classification and EPSS scoring from FIRST.org API.</w:t>
+        <w:t>Developed automated vulnerability assessment pipeline using Nessus and OpenVAS REST APIs in Python, generating CVE reports with CVSS severity and EPSS scoring from FIRST.org API.</w:t>
       </w:r>
     </w:p>
     <w:p>
@@ -691,7 +691,7 @@
           <w:sz w:val="19"/>
           <w:szCs w:val="19"/>
         </w:rPr>
-        <w:t>Developed OWASP Top 10 automated web checker detecting injection, auth, and SSRF vulnerabilities via crafted HTTP requests.</w:t>
+        <w:t>Developed OWASP Top 10 automated web checker to detect web vulnerabilities (injection, auth, SSRF) and documented SQL injection remediation.</w:t>
       </w:r>
     </w:p>
     <w:p>
@@ -710,7 +710,7 @@
           <w:sz w:val="19"/>
           <w:szCs w:val="19"/>
         </w:rPr>
-        <w:t>Automated scan scheduling via Bash and cron; built delta-scan logic to flag new CVEs and calculate remediation deadlines (Critical=24hrs, High=7 days, Medium=30 days).</w:t>
+        <w:t>Automated scan scheduling via Bash and cron; built delta-scan logic to flag new CVEs and calculate remediation SLA deadlines (Critical=24hrs, High=7 days, Medium=30 days).</w:t>
       </w:r>
     </w:p>
     <w:p>
@@ -846,7 +846,7 @@
           <w:sz w:val="19"/>
           <w:szCs w:val="19"/>
         </w:rPr>
-        <w:t>Python, Bash (basic), regular expressions, risk, assessment, response</w:t>
+        <w:t>Python, Bash (basic), regular expressions, security, compliance, incident response</w:t>
       </w:r>
     </w:p>
     <w:p>

</xml_diff>